<commit_message>
Added 50 questions sql inserts txt file
</commit_message>
<xml_diff>
--- a/Fragen.docx
+++ b/Fragen.docx
@@ -333,8 +333,6 @@
     <w:p/>
     <w:p/>
     <w:p/>
-    <w:p/>
-    <w:p/>
     <w:p>
       <w:r>
         <w:rPr>
@@ -483,7 +481,6 @@
         <w:rPr>
           <w:highlight w:val="yellow"/>
         </w:rPr>
-        <w:lastRenderedPageBreak/>
         <w:t>Bei der Beendigung eines Berufsausbildungsverhältnisses hat der Auszubildende Anspruch auf ein Zeugnis. Er hat die Möglichkeit, ein qualifiziertes Zeugnis zu verlangen.</w:t>
       </w:r>
     </w:p>
@@ -677,31 +674,6 @@
     </w:p>
     <w:p>
       <w:pPr>
-        <w:ind w:left="720"/>
-        <w:rPr>
-          <w:highlight w:val="yellow"/>
-        </w:rPr>
-      </w:pPr>
-    </w:p>
-    <w:p>
-      <w:pPr>
-        <w:ind w:left="720"/>
-        <w:rPr>
-          <w:highlight w:val="yellow"/>
-        </w:rPr>
-      </w:pPr>
-    </w:p>
-    <w:p>
-      <w:pPr>
-        <w:ind w:left="720"/>
-        <w:rPr>
-          <w:highlight w:val="yellow"/>
-        </w:rPr>
-      </w:pPr>
-    </w:p>
-    <w:p>
-      <w:pPr>
-        <w:ind w:left="720"/>
         <w:rPr>
           <w:highlight w:val="yellow"/>
         </w:rPr>
@@ -783,7 +755,6 @@
         </w:numPr>
       </w:pPr>
       <w:r>
-        <w:lastRenderedPageBreak/>
         <w:t>Frau Sommer kann nicht kandidieren, weil dem Arbeitgeber doppelte Kosten nicht zuzumuten sind.</w:t>
       </w:r>
     </w:p>
@@ -950,7 +921,6 @@
         </w:numPr>
       </w:pPr>
       <w:r>
-        <w:lastRenderedPageBreak/>
         <w:t>Dr. Michaela Kluge, RA und Notarin</w:t>
       </w:r>
     </w:p>
@@ -972,7 +942,6 @@
     <w:p/>
     <w:p/>
     <w:p/>
-    <w:p/>
     <w:p>
       <w:r>
         <w:t>Aufgabe 12</w:t>
@@ -1076,11 +1045,6 @@
     </w:p>
     <w:p>
       <w:pPr>
-        <w:ind w:left="720"/>
-      </w:pPr>
-    </w:p>
-    <w:p>
-      <w:pPr>
         <w:tabs>
           <w:tab w:val="left" w:pos="1695"/>
         </w:tabs>
@@ -1140,7 +1104,6 @@
         <w:rPr>
           <w:highlight w:val="yellow"/>
         </w:rPr>
-        <w:lastRenderedPageBreak/>
         <w:t>Mitarbeiter der MaHaG KG haben im Rahmen des betrieblichen Vorschlagswesens ein verbessertes Produktionsverfahren entwickelt. Bei der Herstellung ihrer Dampfgarer hat die MaHaG KG bei höherer Produktionsmenge gleiche Stückkosten. Die Geschäftsleitung greift den Verbesserungsvorschlag ihrer Mitarbeiter auf.</w:t>
       </w:r>
     </w:p>
@@ -1337,47 +1300,46 @@
         <w:rPr>
           <w:highlight w:val="yellow"/>
         </w:rPr>
+        <w:t>Drucker und Plotter mit einem hohen Geräuschpegel werden mit einer Schallschutzhaube ausgestattet.</w:t>
+      </w:r>
+    </w:p>
+    <w:p>
+      <w:pPr>
+        <w:numPr>
+          <w:ilvl w:val="0"/>
+          <w:numId w:val="11"/>
+        </w:numPr>
+        <w:rPr>
+          <w:highlight w:val="yellow"/>
+        </w:rPr>
+      </w:pPr>
+      <w:r>
+        <w:rPr>
+          <w:highlight w:val="yellow"/>
+        </w:rPr>
+        <w:t>Es werden nur noch LEDs für die Beleuchtung eingesetzt.</w:t>
+      </w:r>
+    </w:p>
+    <w:p>
+      <w:pPr>
+        <w:numPr>
+          <w:ilvl w:val="0"/>
+          <w:numId w:val="11"/>
+        </w:numPr>
+      </w:pPr>
+      <w:r>
+        <w:t>Eine hochtourig laufende Drehmaschine wird mit einer Sicherheitseinrichtung nachgerüstet.</w:t>
+      </w:r>
+    </w:p>
+    <w:p/>
+    <w:p/>
+    <w:p/>
+    <w:p/>
+    <w:p/>
+    <w:p/>
+    <w:p>
+      <w:r>
         <w:lastRenderedPageBreak/>
-        <w:t>Drucker und Plotter mit einem hohen Geräuschpegel werden mit einer Schallschutzhaube ausgestattet.</w:t>
-      </w:r>
-    </w:p>
-    <w:p>
-      <w:pPr>
-        <w:numPr>
-          <w:ilvl w:val="0"/>
-          <w:numId w:val="11"/>
-        </w:numPr>
-        <w:rPr>
-          <w:highlight w:val="yellow"/>
-        </w:rPr>
-      </w:pPr>
-      <w:r>
-        <w:rPr>
-          <w:highlight w:val="yellow"/>
-        </w:rPr>
-        <w:t>Es werden nur noch LEDs für die Beleuchtung eingesetzt.</w:t>
-      </w:r>
-    </w:p>
-    <w:p>
-      <w:pPr>
-        <w:numPr>
-          <w:ilvl w:val="0"/>
-          <w:numId w:val="11"/>
-        </w:numPr>
-      </w:pPr>
-      <w:r>
-        <w:t>Eine hochtourig laufende Drehmaschine wird mit einer Sicherheitseinrichtung nachgerüstet.</w:t>
-      </w:r>
-    </w:p>
-    <w:p/>
-    <w:p/>
-    <w:p/>
-    <w:p/>
-    <w:p/>
-    <w:p/>
-    <w:p/>
-    <w:p>
-      <w:r>
         <w:t xml:space="preserve">Aufgabe 16 </w:t>
       </w:r>
     </w:p>
@@ -1470,7 +1432,6 @@
         </w:numPr>
       </w:pPr>
       <w:r>
-        <w:lastRenderedPageBreak/>
         <w:t>Die Kapazitätsauslastung nähert sich ihrem Höhepunkt.</w:t>
       </w:r>
     </w:p>
@@ -1502,6 +1463,7 @@
         <w:t>Ein wirtschaftlicher Abschwung führt zum Abbau von Überstunden und von Arbeitsplätzen.</w:t>
       </w:r>
     </w:p>
+    <w:p/>
     <w:p/>
     <w:p/>
     <w:p/>
@@ -1637,7 +1599,6 @@
         <w:rPr>
           <w:highlight w:val="yellow"/>
         </w:rPr>
-        <w:lastRenderedPageBreak/>
         <w:t>Gleichgewichtsmenge</w:t>
       </w:r>
     </w:p>
@@ -1793,6 +1754,13 @@
       </w:pPr>
     </w:p>
     <w:p>
+      <w:pPr>
+        <w:rPr>
+          <w:highlight w:val="yellow"/>
+        </w:rPr>
+      </w:pPr>
+    </w:p>
+    <w:p>
       <w:r>
         <w:t>Aufgabe 21</w:t>
       </w:r>
@@ -1810,11 +1778,7 @@
         </w:numPr>
       </w:pPr>
       <w:r>
-        <w:t xml:space="preserve">Konjunkturphase Rezession: Die Nachfrage nach Haushaltsgeräten wird ihren Tiefstand erreichen, was einhergeht mit einer hohen Arbeitslosigkeit. Die MaHaG </w:t>
-      </w:r>
-      <w:r>
-        <w:lastRenderedPageBreak/>
-        <w:t>KG hält das bisherige Produktionsniveau aufrecht, um bei künftiger Nachfrage lieferbereit zu sein.</w:t>
+        <w:t>Konjunkturphase Rezession: Die Nachfrage nach Haushaltsgeräten wird ihren Tiefstand erreichen, was einhergeht mit einer hohen Arbeitslosigkeit. Die MaHaG KG hält das bisherige Produktionsniveau aufrecht, um bei künftiger Nachfrage lieferbereit zu sein.</w:t>
       </w:r>
     </w:p>
     <w:p>
@@ -2009,7 +1973,6 @@
         </w:numPr>
       </w:pPr>
       <w:r>
-        <w:lastRenderedPageBreak/>
         <w:t>Im Krankheitsfall erhalten Auszubildende keine Entgeltfortzahlung, weil sie keine Arbeitnehmer sind.</w:t>
       </w:r>
     </w:p>
@@ -2224,7 +2187,6 @@
         </w:numPr>
       </w:pPr>
       <w:r>
-        <w:lastRenderedPageBreak/>
         <w:t>Gesellschaft mit beschränkter Haftung (GmbH)</w:t>
       </w:r>
     </w:p>
@@ -2259,11 +2221,6 @@
       </w:r>
     </w:p>
     <w:p>
-      <w:pPr>
-        <w:ind w:left="720"/>
-      </w:pPr>
-    </w:p>
-    <w:p>
       <w:r>
         <w:t>Aufgabe 26</w:t>
       </w:r>
@@ -2339,6 +2296,8 @@
         <w:t>… wird beim Amtsgericht (Handelsregister) hinterlegt.</w:t>
       </w:r>
     </w:p>
+    <w:p/>
+    <w:p/>
     <w:p/>
     <w:p>
       <w:r>
@@ -2423,7 +2382,6 @@
         </w:numPr>
       </w:pPr>
       <w:r>
-        <w:lastRenderedPageBreak/>
         <w:t>mindestens 25 Werktage, wenn der Jugendliche zu Beginn des Kalenderjahrs noch nicht 18 Jahre alt ist.</w:t>
       </w:r>
     </w:p>
@@ -2559,7 +2517,6 @@
     </w:p>
     <w:p>
       <w:r>
-        <w:lastRenderedPageBreak/>
         <w:t>Fatima Kuslu, 17 Jahre alt, hat am 1. September ihre Berufsausbildung als Fachinformatikerin bei der MaHaG KG begonnen. Welche Vorschrift des Jugendarbeitsschutzgesetzes gilt für sie?</w:t>
       </w:r>
     </w:p>
@@ -3046,7 +3003,6 @@
         <w:ind w:left="360"/>
       </w:pPr>
       <w:r>
-        <w:lastRenderedPageBreak/>
         <w:t>Aufgabe 35</w:t>
       </w:r>
     </w:p>
@@ -3237,7 +3193,6 @@
         </w:numPr>
       </w:pPr>
       <w:r>
-        <w:lastRenderedPageBreak/>
         <w:t>acht Jahre bestanden hat, drei Monate zum Ende eines Kalendermonats,</w:t>
       </w:r>
     </w:p>
@@ -3458,9 +3413,6 @@
       </w:r>
       <w:r>
         <w:br/>
-      </w:r>
-      <w:r>
-        <w:lastRenderedPageBreak/>
         <w:t>201 bis 400 Arbeitnehmern aus 9 Mitgliedern,</w:t>
       </w:r>
       <w:r>
@@ -3499,6 +3451,14 @@
     </w:p>
     <w:p/>
     <w:p/>
+    <w:p/>
+    <w:p/>
+    <w:p/>
+    <w:p/>
+    <w:p/>
+    <w:p/>
+    <w:p/>
+    <w:p/>
     <w:p>
       <w:r>
         <w:t xml:space="preserve">Aufgabe 38 </w:t>
@@ -3663,6 +3623,14 @@
       </w:r>
     </w:p>
     <w:p/>
+    <w:p/>
+    <w:p/>
+    <w:p/>
+    <w:p/>
+    <w:p/>
+    <w:p/>
+    <w:p/>
+    <w:p/>
     <w:p>
       <w:r>
         <w:t xml:space="preserve">Aufgabe 40 </w:t>
@@ -3761,21 +3729,7 @@
         <w:ind w:left="720"/>
       </w:pPr>
     </w:p>
-    <w:p>
-      <w:pPr>
-        <w:ind w:left="720"/>
-      </w:pPr>
-    </w:p>
-    <w:p>
-      <w:pPr>
-        <w:ind w:left="720"/>
-      </w:pPr>
-    </w:p>
-    <w:p>
-      <w:pPr>
-        <w:ind w:left="720"/>
-      </w:pPr>
-    </w:p>
+    <w:p/>
     <w:p>
       <w:pPr>
         <w:ind w:left="720"/>
@@ -4009,6 +3963,8 @@
       </w:r>
     </w:p>
     <w:p/>
+    <w:p/>
+    <w:p/>
     <w:p>
       <w:r>
         <w:t>Aufgabe 44</w:t>
@@ -4016,107 +3972,152 @@
     </w:p>
     <w:p>
       <w:r>
+        <w:t>Prüfen Sie, welche der nachstehenden Aussagen über den einfachen Wirtschaftskreislauf richtig ist.</w:t>
+      </w:r>
+    </w:p>
+    <w:p>
+      <w:pPr>
+        <w:numPr>
+          <w:ilvl w:val="0"/>
+          <w:numId w:val="40"/>
+        </w:numPr>
+      </w:pPr>
+      <w:r>
+        <w:t>Die Einkommen in Form von Löhnen und Gehältern fließen von den privaten Haushalten in die Unternehmen.</w:t>
+      </w:r>
+    </w:p>
+    <w:p>
+      <w:pPr>
+        <w:numPr>
+          <w:ilvl w:val="0"/>
+          <w:numId w:val="40"/>
+        </w:numPr>
+        <w:rPr>
+          <w:highlight w:val="yellow"/>
+        </w:rPr>
+      </w:pPr>
+      <w:r>
+        <w:rPr>
+          <w:highlight w:val="yellow"/>
+        </w:rPr>
+        <w:t>Die Einkommen in Form von Löhnen und Gehältern sind Teil des Geldstromes, der von den Unternehmen zu den Haushalten fließt.</w:t>
+      </w:r>
+    </w:p>
+    <w:p>
+      <w:pPr>
+        <w:numPr>
+          <w:ilvl w:val="0"/>
+          <w:numId w:val="40"/>
+        </w:numPr>
+      </w:pPr>
+      <w:r>
+        <w:t>Die Konsumausgaben für Güter fließen von den Unternehmen in die privaten Haushalte.</w:t>
+      </w:r>
+    </w:p>
+    <w:p>
+      <w:pPr>
+        <w:numPr>
+          <w:ilvl w:val="0"/>
+          <w:numId w:val="40"/>
+        </w:numPr>
+      </w:pPr>
+      <w:r>
+        <w:t>Produktionsgüter sind Teil des Güterstroms von den privaten Haushalten in die Richtung der Unternehmen.</w:t>
+      </w:r>
+    </w:p>
+    <w:p>
+      <w:pPr>
+        <w:ind w:left="720"/>
+      </w:pPr>
+    </w:p>
+    <w:p>
+      <w:pPr>
+        <w:ind w:left="720"/>
+      </w:pPr>
+    </w:p>
+    <w:p>
+      <w:pPr>
+        <w:ind w:left="720"/>
+      </w:pPr>
+    </w:p>
+    <w:p>
+      <w:pPr>
+        <w:ind w:left="720"/>
+      </w:pPr>
+    </w:p>
+    <w:p>
+      <w:pPr>
+        <w:ind w:left="720"/>
+      </w:pPr>
+    </w:p>
+    <w:p>
+      <w:pPr>
+        <w:ind w:left="720"/>
+      </w:pPr>
+    </w:p>
+    <w:p>
+      <w:pPr>
+        <w:ind w:left="720"/>
+      </w:pPr>
+    </w:p>
+    <w:p>
+      <w:pPr>
+        <w:ind w:left="720"/>
+      </w:pPr>
+    </w:p>
+    <w:p>
+      <w:pPr>
+        <w:ind w:left="720"/>
+      </w:pPr>
+    </w:p>
+    <w:p>
+      <w:pPr>
+        <w:ind w:left="720"/>
+      </w:pPr>
+    </w:p>
+    <w:p>
+      <w:pPr>
+        <w:ind w:left="720"/>
+      </w:pPr>
+    </w:p>
+    <w:p>
+      <w:pPr>
+        <w:ind w:left="720"/>
+      </w:pPr>
+    </w:p>
+    <w:p>
+      <w:pPr>
+        <w:ind w:left="720"/>
+      </w:pPr>
+    </w:p>
+    <w:p>
+      <w:pPr>
+        <w:ind w:left="720"/>
+      </w:pPr>
+    </w:p>
+    <w:p>
+      <w:pPr>
+        <w:ind w:left="720"/>
+      </w:pPr>
+    </w:p>
+    <w:p>
+      <w:pPr>
+        <w:ind w:left="720"/>
+      </w:pPr>
+    </w:p>
+    <w:p>
+      <w:pPr>
+        <w:ind w:left="720"/>
+      </w:pPr>
+    </w:p>
+    <w:p>
+      <w:pPr>
+        <w:ind w:left="720"/>
+      </w:pPr>
+    </w:p>
+    <w:p>
+      <w:r>
         <w:lastRenderedPageBreak/>
-        <w:t>Prüfen Sie, welche der nachstehenden Aussagen über den einfachen Wirtschaftskreislauf richtig ist.</w:t>
-      </w:r>
-    </w:p>
-    <w:p>
-      <w:pPr>
-        <w:numPr>
-          <w:ilvl w:val="0"/>
-          <w:numId w:val="40"/>
-        </w:numPr>
-      </w:pPr>
-      <w:r>
-        <w:t>Die Einkommen in Form von Löhnen und Gehältern fließen von den privaten Haushalten in die Unternehmen.</w:t>
-      </w:r>
-    </w:p>
-    <w:p>
-      <w:pPr>
-        <w:numPr>
-          <w:ilvl w:val="0"/>
-          <w:numId w:val="40"/>
-        </w:numPr>
-        <w:rPr>
-          <w:highlight w:val="yellow"/>
-        </w:rPr>
-      </w:pPr>
-      <w:r>
-        <w:rPr>
-          <w:highlight w:val="yellow"/>
-        </w:rPr>
-        <w:t>Die Einkommen in Form von Löhnen und Gehältern sind Teil des Geldstromes, der von den Unternehmen zu den Haushalten fließt.</w:t>
-      </w:r>
-    </w:p>
-    <w:p>
-      <w:pPr>
-        <w:numPr>
-          <w:ilvl w:val="0"/>
-          <w:numId w:val="40"/>
-        </w:numPr>
-      </w:pPr>
-      <w:r>
-        <w:t>Die Konsumausgaben für Güter fließen von den Unternehmen in die privaten Haushalte.</w:t>
-      </w:r>
-    </w:p>
-    <w:p>
-      <w:pPr>
-        <w:numPr>
-          <w:ilvl w:val="0"/>
-          <w:numId w:val="40"/>
-        </w:numPr>
-      </w:pPr>
-      <w:r>
-        <w:t>Produktionsgüter sind Teil des Güterstroms von den privaten Haushalten in die Richtung der Unternehmen.</w:t>
-      </w:r>
-    </w:p>
-    <w:p>
-      <w:pPr>
-        <w:ind w:left="720"/>
-      </w:pPr>
-    </w:p>
-    <w:p>
-      <w:pPr>
-        <w:ind w:left="720"/>
-      </w:pPr>
-    </w:p>
-    <w:p>
-      <w:pPr>
-        <w:ind w:left="720"/>
-      </w:pPr>
-    </w:p>
-    <w:p>
-      <w:pPr>
-        <w:ind w:left="720"/>
-      </w:pPr>
-    </w:p>
-    <w:p>
-      <w:pPr>
-        <w:ind w:left="720"/>
-      </w:pPr>
-    </w:p>
-    <w:p>
-      <w:pPr>
-        <w:ind w:left="720"/>
-      </w:pPr>
-    </w:p>
-    <w:p>
-      <w:pPr>
-        <w:ind w:left="720"/>
-      </w:pPr>
-    </w:p>
-    <w:p>
-      <w:pPr>
-        <w:ind w:left="720"/>
-      </w:pPr>
-    </w:p>
-    <w:p>
-      <w:pPr>
-        <w:ind w:left="720"/>
-      </w:pPr>
-    </w:p>
-    <w:p>
-      <w:r>
         <w:t>Aufgabe 45</w:t>
       </w:r>
     </w:p>
@@ -4189,263 +4190,263 @@
         </w:numPr>
       </w:pPr>
       <w:r>
+        <w:t>Jeder Mitarbeiter kann Weisungen nur von einer Stelle bekommen.</w:t>
+      </w:r>
+    </w:p>
+    <w:p>
+      <w:pPr>
+        <w:numPr>
+          <w:ilvl w:val="0"/>
+          <w:numId w:val="41"/>
+        </w:numPr>
+      </w:pPr>
+      <w:r>
+        <w:t>Informationen werden schnell weitergeleitet.</w:t>
+      </w:r>
+    </w:p>
+    <w:p/>
+    <w:p/>
+    <w:p>
+      <w:r>
+        <w:t xml:space="preserve">Aufgabe 46 </w:t>
+      </w:r>
+    </w:p>
+    <w:p>
+      <w:r>
+        <w:t xml:space="preserve">Clara </w:t>
+      </w:r>
+      <w:proofErr w:type="spellStart"/>
+      <w:r>
+        <w:t>Bürscheid</w:t>
+      </w:r>
+      <w:proofErr w:type="spellEnd"/>
+      <w:r>
+        <w:t xml:space="preserve"> (21 Jahre), Mitarbeiterin im Einkauf, möchte sich bei den anstehenden Wahlen der Jugend- und Auszubildendenvertretung als Kandidatin aufstellen lassen.</w:t>
+      </w:r>
+    </w:p>
+    <w:p>
+      <w:r>
+        <w:t>Welche Voraussetzung hierzu muss sie erfüllen?</w:t>
+      </w:r>
+    </w:p>
+    <w:p>
+      <w:pPr>
+        <w:numPr>
+          <w:ilvl w:val="0"/>
+          <w:numId w:val="42"/>
+        </w:numPr>
+      </w:pPr>
+      <w:r>
+        <w:t>Sie muss mindestens im 2. Ausbildungsjahr sein.</w:t>
+      </w:r>
+    </w:p>
+    <w:p>
+      <w:pPr>
+        <w:numPr>
+          <w:ilvl w:val="0"/>
+          <w:numId w:val="42"/>
+        </w:numPr>
+      </w:pPr>
+      <w:r>
+        <w:t>Sie muss die deutsche Staatsangehörigkeit aufweisen.</w:t>
+      </w:r>
+    </w:p>
+    <w:p>
+      <w:pPr>
+        <w:numPr>
+          <w:ilvl w:val="0"/>
+          <w:numId w:val="42"/>
+        </w:numPr>
+      </w:pPr>
+      <w:r>
+        <w:t>Sie muss bereits Erfahrung als Mitglied des Betriebsrates gesammelt haben.</w:t>
+      </w:r>
+    </w:p>
+    <w:p>
+      <w:pPr>
+        <w:numPr>
+          <w:ilvl w:val="0"/>
+          <w:numId w:val="42"/>
+        </w:numPr>
+        <w:rPr>
+          <w:highlight w:val="yellow"/>
+        </w:rPr>
+      </w:pPr>
+      <w:r>
+        <w:rPr>
+          <w:highlight w:val="yellow"/>
+        </w:rPr>
+        <w:t>Sie darf nicht Mitglied des Betriebsrates sein.</w:t>
+      </w:r>
+    </w:p>
+    <w:p>
+      <w:pPr>
+        <w:numPr>
+          <w:ilvl w:val="0"/>
+          <w:numId w:val="42"/>
+        </w:numPr>
+      </w:pPr>
+      <w:r>
+        <w:t>Sie muss mindestens 3 Monate dem Betrieb angehören.</w:t>
+      </w:r>
+    </w:p>
+    <w:p/>
+    <w:p/>
+    <w:p/>
+    <w:p/>
+    <w:p/>
+    <w:p/>
+    <w:p>
+      <w:r>
+        <w:t xml:space="preserve">Aufgabe </w:t>
+      </w:r>
+      <w:proofErr w:type="gramStart"/>
+      <w:r>
+        <w:t>47 :</w:t>
+      </w:r>
+      <w:proofErr w:type="gramEnd"/>
+    </w:p>
+    <w:p>
+      <w:r>
+        <w:t>Die Mannheimer Haushaltsgeräte KG möchte einen zusätzlichen Beitrag zum Umweltschutz leisten, den sie wirksam einem breiten Publikum präsentieren wird. Prüfen Sie, wie sie das erreichen kann.</w:t>
+      </w:r>
+    </w:p>
+    <w:p>
+      <w:pPr>
+        <w:numPr>
+          <w:ilvl w:val="0"/>
+          <w:numId w:val="43"/>
+        </w:numPr>
+      </w:pPr>
+      <w:r>
+        <w:t xml:space="preserve">In der Werkskantine stellt sie von Mehrwegflaschen auf </w:t>
+      </w:r>
+      <w:proofErr w:type="spellStart"/>
+      <w:r>
+        <w:t>Tetra-Pak</w:t>
+      </w:r>
+      <w:proofErr w:type="spellEnd"/>
+      <w:r>
+        <w:t>-Behälter um.</w:t>
+      </w:r>
+    </w:p>
+    <w:p>
+      <w:pPr>
+        <w:numPr>
+          <w:ilvl w:val="0"/>
+          <w:numId w:val="43"/>
+        </w:numPr>
+      </w:pPr>
+      <w:r>
+        <w:t>Für ihre Küchenserie im Landhaus-Stil verwendet sie tropische Edelhölzer und leistet damit einen Beitrag zur nachhaltigen Wirtschaftsförderung in Schwellenländern.</w:t>
+      </w:r>
+    </w:p>
+    <w:p>
+      <w:pPr>
+        <w:numPr>
+          <w:ilvl w:val="0"/>
+          <w:numId w:val="43"/>
+        </w:numPr>
+      </w:pPr>
+      <w:r>
+        <w:t>Einen Teil ihres Fuhrparks stattet sie mit Hybridfahrzeugen aus.</w:t>
+      </w:r>
+    </w:p>
+    <w:p>
+      <w:pPr>
+        <w:numPr>
+          <w:ilvl w:val="0"/>
+          <w:numId w:val="43"/>
+        </w:numPr>
+        <w:rPr>
+          <w:highlight w:val="yellow"/>
+        </w:rPr>
+      </w:pPr>
+      <w:r>
+        <w:rPr>
+          <w:highlight w:val="yellow"/>
+        </w:rPr>
+        <w:t>Für die Versiegelung ihrer Granit-Küchen-Arbeitsplatten verwendet sie Lacke auf Wasserbasis.</w:t>
+      </w:r>
+    </w:p>
+    <w:p>
+      <w:pPr>
+        <w:rPr>
+          <w:highlight w:val="yellow"/>
+        </w:rPr>
+      </w:pPr>
+    </w:p>
+    <w:p>
+      <w:r>
+        <w:t xml:space="preserve">Aufgabe 48 </w:t>
+      </w:r>
+    </w:p>
+    <w:p>
+      <w:r>
+        <w:t>Nachhaltiges Wirtschaften zeichnet sich insbesondere dadurch aus, dass Ressourcen wiederverwendet werden. Bei welcher der folgenden Maßnahmen handelt die Mannheimer Haushaltsgeräte KG nachhaltig?</w:t>
+      </w:r>
+    </w:p>
+    <w:p>
+      <w:pPr>
+        <w:numPr>
+          <w:ilvl w:val="0"/>
+          <w:numId w:val="44"/>
+        </w:numPr>
+      </w:pPr>
+      <w:r>
+        <w:t>Sie ersetzt in der Werkskantine Getränkedosen durch Flaschen.</w:t>
+      </w:r>
+    </w:p>
+    <w:p>
+      <w:pPr>
+        <w:numPr>
+          <w:ilvl w:val="0"/>
+          <w:numId w:val="44"/>
+        </w:numPr>
+        <w:rPr>
+          <w:highlight w:val="yellow"/>
+        </w:rPr>
+      </w:pPr>
+      <w:r>
+        <w:rPr>
+          <w:highlight w:val="yellow"/>
+        </w:rPr>
+        <w:t>Sie nimmt Transportpaletten nach erfolgter Lieferung zurück und verwendet diese für weitere Lieferungen.</w:t>
+      </w:r>
+    </w:p>
+    <w:p>
+      <w:pPr>
+        <w:numPr>
+          <w:ilvl w:val="0"/>
+          <w:numId w:val="44"/>
+        </w:numPr>
+      </w:pPr>
+      <w:r>
+        <w:t>Überall im Unternehmen gibt es Behälter für Batterien, die an Sammelstellen zurückgegeben werden.</w:t>
+      </w:r>
+    </w:p>
+    <w:p>
+      <w:pPr>
+        <w:numPr>
+          <w:ilvl w:val="0"/>
+          <w:numId w:val="44"/>
+        </w:numPr>
+      </w:pPr>
+      <w:r>
+        <w:t>Bei der Produktion entstehende Metallreste werden eingeschmolzen und zur Herstellung neuer Bleche verwendet.</w:t>
+      </w:r>
+    </w:p>
+    <w:p/>
+    <w:p/>
+    <w:p/>
+    <w:p/>
+    <w:p/>
+    <w:p/>
+    <w:p/>
+    <w:p/>
+    <w:p>
+      <w:r>
         <w:lastRenderedPageBreak/>
-        <w:t>Jeder Mitarbeiter kann Weisungen nur von einer Stelle bekommen.</w:t>
-      </w:r>
-    </w:p>
-    <w:p>
-      <w:pPr>
-        <w:numPr>
-          <w:ilvl w:val="0"/>
-          <w:numId w:val="41"/>
-        </w:numPr>
-      </w:pPr>
-      <w:r>
-        <w:t>Informationen werden schnell weitergeleitet.</w:t>
-      </w:r>
-    </w:p>
-    <w:p/>
-    <w:p/>
-    <w:p>
-      <w:r>
-        <w:t xml:space="preserve">Aufgabe 46 </w:t>
-      </w:r>
-    </w:p>
-    <w:p>
-      <w:r>
-        <w:t xml:space="preserve">Clara </w:t>
-      </w:r>
-      <w:proofErr w:type="spellStart"/>
-      <w:r>
-        <w:t>Bürscheid</w:t>
-      </w:r>
-      <w:proofErr w:type="spellEnd"/>
-      <w:r>
-        <w:t xml:space="preserve"> (21 Jahre), Mitarbeiterin im Einkauf, möchte sich bei den anstehenden Wahlen der Jugend- und Auszubildendenvertretung als Kandidatin aufstellen lassen.</w:t>
-      </w:r>
-    </w:p>
-    <w:p>
-      <w:r>
-        <w:t>Welche Voraussetzung hierzu muss sie erfüllen?</w:t>
-      </w:r>
-    </w:p>
-    <w:p>
-      <w:pPr>
-        <w:numPr>
-          <w:ilvl w:val="0"/>
-          <w:numId w:val="42"/>
-        </w:numPr>
-      </w:pPr>
-      <w:r>
-        <w:t>Sie muss mindestens im 2. Ausbildungsjahr sein.</w:t>
-      </w:r>
-    </w:p>
-    <w:p>
-      <w:pPr>
-        <w:numPr>
-          <w:ilvl w:val="0"/>
-          <w:numId w:val="42"/>
-        </w:numPr>
-      </w:pPr>
-      <w:r>
-        <w:t>Sie muss die deutsche Staatsangehörigkeit aufweisen.</w:t>
-      </w:r>
-    </w:p>
-    <w:p>
-      <w:pPr>
-        <w:numPr>
-          <w:ilvl w:val="0"/>
-          <w:numId w:val="42"/>
-        </w:numPr>
-      </w:pPr>
-      <w:r>
-        <w:t>Sie muss bereits Erfahrung als Mitglied des Betriebsrates gesammelt haben.</w:t>
-      </w:r>
-    </w:p>
-    <w:p>
-      <w:pPr>
-        <w:numPr>
-          <w:ilvl w:val="0"/>
-          <w:numId w:val="42"/>
-        </w:numPr>
-        <w:rPr>
-          <w:highlight w:val="yellow"/>
-        </w:rPr>
-      </w:pPr>
-      <w:r>
-        <w:rPr>
-          <w:highlight w:val="yellow"/>
-        </w:rPr>
-        <w:t>Sie darf nicht Mitglied des Betriebsrates sein.</w:t>
-      </w:r>
-    </w:p>
-    <w:p>
-      <w:pPr>
-        <w:numPr>
-          <w:ilvl w:val="0"/>
-          <w:numId w:val="42"/>
-        </w:numPr>
-      </w:pPr>
-      <w:r>
-        <w:t>Sie muss mindestens 3 Monate dem Betrieb angehören.</w:t>
-      </w:r>
-    </w:p>
-    <w:p/>
-    <w:p/>
-    <w:p/>
-    <w:p/>
-    <w:p/>
-    <w:p/>
-    <w:p>
-      <w:r>
-        <w:t xml:space="preserve">Aufgabe </w:t>
-      </w:r>
-      <w:proofErr w:type="gramStart"/>
-      <w:r>
-        <w:t>47 :</w:t>
-      </w:r>
-      <w:proofErr w:type="gramEnd"/>
-    </w:p>
-    <w:p>
-      <w:r>
-        <w:t>Die Mannheimer Haushaltsgeräte KG möchte einen zusätzlichen Beitrag zum Umweltschutz leisten, den sie wirksam einem breiten Publikum präsentieren wird. Prüfen Sie, wie sie das erreichen kann.</w:t>
-      </w:r>
-    </w:p>
-    <w:p>
-      <w:pPr>
-        <w:numPr>
-          <w:ilvl w:val="0"/>
-          <w:numId w:val="43"/>
-        </w:numPr>
-      </w:pPr>
-      <w:r>
-        <w:t xml:space="preserve">In der Werkskantine stellt sie von Mehrwegflaschen auf </w:t>
-      </w:r>
-      <w:proofErr w:type="spellStart"/>
-      <w:r>
-        <w:t>Tetra-Pak</w:t>
-      </w:r>
-      <w:proofErr w:type="spellEnd"/>
-      <w:r>
-        <w:t>-Behälter um.</w:t>
-      </w:r>
-    </w:p>
-    <w:p>
-      <w:pPr>
-        <w:numPr>
-          <w:ilvl w:val="0"/>
-          <w:numId w:val="43"/>
-        </w:numPr>
-      </w:pPr>
-      <w:r>
-        <w:t>Für ihre Küchenserie im Landhaus-Stil verwendet sie tropische Edelhölzer und leistet damit einen Beitrag zur nachhaltigen Wirtschaftsförderung in Schwellenländern.</w:t>
-      </w:r>
-    </w:p>
-    <w:p>
-      <w:pPr>
-        <w:numPr>
-          <w:ilvl w:val="0"/>
-          <w:numId w:val="43"/>
-        </w:numPr>
-      </w:pPr>
-      <w:r>
-        <w:t>Einen Teil ihres Fuhrparks stattet sie mit Hybridfahrzeugen aus.</w:t>
-      </w:r>
-    </w:p>
-    <w:p>
-      <w:pPr>
-        <w:numPr>
-          <w:ilvl w:val="0"/>
-          <w:numId w:val="43"/>
-        </w:numPr>
-        <w:rPr>
-          <w:highlight w:val="yellow"/>
-        </w:rPr>
-      </w:pPr>
-      <w:r>
-        <w:rPr>
-          <w:highlight w:val="yellow"/>
-        </w:rPr>
-        <w:t>Für die Versiegelung ihrer Granit-Küchen-Arbeitsplatten verwendet sie Lacke auf Wasserbasis.</w:t>
-      </w:r>
-    </w:p>
-    <w:p>
-      <w:pPr>
-        <w:rPr>
-          <w:highlight w:val="yellow"/>
-        </w:rPr>
-      </w:pPr>
-    </w:p>
-    <w:p>
-      <w:r>
-        <w:t xml:space="preserve">Aufgabe 48 </w:t>
-      </w:r>
-    </w:p>
-    <w:p>
-      <w:r>
-        <w:t>Nachhaltiges Wirtschaften zeichnet sich insbesondere dadurch aus, dass Ressourcen wiederverwendet werden. Bei welcher der folgenden Maßnahmen handelt die Mannheimer Haushaltsgeräte KG nachhaltig?</w:t>
-      </w:r>
-    </w:p>
-    <w:p>
-      <w:pPr>
-        <w:numPr>
-          <w:ilvl w:val="0"/>
-          <w:numId w:val="44"/>
-        </w:numPr>
-      </w:pPr>
-      <w:r>
-        <w:t>Sie ersetzt in der Werkskantine Getränkedosen durch Flaschen.</w:t>
-      </w:r>
-    </w:p>
-    <w:p>
-      <w:pPr>
-        <w:numPr>
-          <w:ilvl w:val="0"/>
-          <w:numId w:val="44"/>
-        </w:numPr>
-        <w:rPr>
-          <w:highlight w:val="yellow"/>
-        </w:rPr>
-      </w:pPr>
-      <w:r>
-        <w:rPr>
-          <w:highlight w:val="yellow"/>
-        </w:rPr>
-        <w:t>Sie nimmt Transportpaletten nach erfolgter Lieferung zurück und verwendet diese für weitere Lieferungen.</w:t>
-      </w:r>
-    </w:p>
-    <w:p>
-      <w:pPr>
-        <w:numPr>
-          <w:ilvl w:val="0"/>
-          <w:numId w:val="44"/>
-        </w:numPr>
-      </w:pPr>
-      <w:r>
-        <w:t>Überall im Unternehmen gibt es Behälter für Batterien, die an Sammelstellen zurückgegeben werden.</w:t>
-      </w:r>
-    </w:p>
-    <w:p>
-      <w:pPr>
-        <w:numPr>
-          <w:ilvl w:val="0"/>
-          <w:numId w:val="44"/>
-        </w:numPr>
-      </w:pPr>
-      <w:r>
-        <w:t>Bei der Produktion entstehende Metallreste werden eingeschmolzen und zur Herstellung neuer Bleche verwendet.</w:t>
-      </w:r>
-    </w:p>
-    <w:p/>
-    <w:p/>
-    <w:p/>
-    <w:p/>
-    <w:p/>
-    <w:p/>
-    <w:p/>
-    <w:p/>
-    <w:p>
-      <w:r>
         <w:t xml:space="preserve">Aufgabe 49 </w:t>
       </w:r>
     </w:p>

</xml_diff>